<commit_message>
Completed app - Guacamole
</commit_message>
<xml_diff>
--- a/docs/adr/Lab №2.docx
+++ b/docs/adr/Lab №2.docx
@@ -62,6 +62,113 @@
     <w:p>
       <w:pPr>
         <w:ind w:left="-709" w:firstLine="1560"/>
+      </w:pPr>
+    </w:p>
+    <w:p>
+      <w:pPr>
+        <w:ind w:firstLine="567"/>
+        <w:rPr>
+          <w:b/>
+          <w:bCs/>
+          <w:lang w:val="en-US"/>
+        </w:rPr>
+      </w:pPr>
+      <w:r>
+        <w:rPr>
+          <w:b/>
+          <w:bCs/>
+        </w:rPr>
+        <w:t>Состав команды</w:t>
+      </w:r>
+      <w:r>
+        <w:rPr>
+          <w:b/>
+          <w:bCs/>
+          <w:lang w:val="en-US"/>
+        </w:rPr>
+        <w:t>:</w:t>
+      </w:r>
+    </w:p>
+    <w:p>
+      <w:pPr>
+        <w:pStyle w:val="a7"/>
+        <w:numPr>
+          <w:ilvl w:val="0"/>
+          <w:numId w:val="4"/>
+        </w:numPr>
+        <w:rPr>
+          <w:b/>
+          <w:bCs/>
+          <w:lang w:val="en-US"/>
+        </w:rPr>
+      </w:pPr>
+      <w:r>
+        <w:rPr>
+          <w:b/>
+          <w:bCs/>
+        </w:rPr>
+        <w:t>Долгушин В.В.</w:t>
+      </w:r>
+    </w:p>
+    <w:p>
+      <w:pPr>
+        <w:pStyle w:val="a7"/>
+        <w:numPr>
+          <w:ilvl w:val="0"/>
+          <w:numId w:val="4"/>
+        </w:numPr>
+        <w:rPr>
+          <w:b/>
+          <w:bCs/>
+          <w:lang w:val="en-US"/>
+        </w:rPr>
+      </w:pPr>
+      <w:r>
+        <w:rPr>
+          <w:b/>
+          <w:bCs/>
+        </w:rPr>
+        <w:t>Волков В.</w:t>
+      </w:r>
+    </w:p>
+    <w:p>
+      <w:pPr>
+        <w:pStyle w:val="a7"/>
+        <w:numPr>
+          <w:ilvl w:val="0"/>
+          <w:numId w:val="4"/>
+        </w:numPr>
+        <w:rPr>
+          <w:b/>
+          <w:bCs/>
+          <w:lang w:val="en-US"/>
+        </w:rPr>
+      </w:pPr>
+      <w:proofErr w:type="spellStart"/>
+      <w:r>
+        <w:rPr>
+          <w:b/>
+          <w:bCs/>
+          <w:lang w:val="en-US"/>
+        </w:rPr>
+        <w:t>Жукова</w:t>
+      </w:r>
+      <w:proofErr w:type="spellEnd"/>
+      <w:r>
+        <w:rPr>
+          <w:b/>
+          <w:bCs/>
+          <w:lang w:val="en-US"/>
+        </w:rPr>
+        <w:t xml:space="preserve"> А.С.</w:t>
+      </w:r>
+    </w:p>
+    <w:p>
+      <w:pPr>
+        <w:ind w:left="-709" w:firstLine="1560"/>
+        <w:rPr>
+          <w:lang w:val="en-US"/>
+        </w:rPr>
       </w:pPr>
     </w:p>
     <w:p>
@@ -433,6 +540,7 @@
           <w:noProof/>
           <w:lang w:val="en-US"/>
         </w:rPr>
+        <w:lastRenderedPageBreak/>
         <w:drawing>
           <wp:inline distT="0" distB="0" distL="0" distR="0" wp14:anchorId="3ACBE6FB" wp14:editId="03B47563">
             <wp:extent cx="5940425" cy="2799080"/>
@@ -506,7 +614,6 @@
         <w:rPr>
           <w:rFonts w:cs="Times New Roman"/>
         </w:rPr>
-        <w:lastRenderedPageBreak/>
         <w:t xml:space="preserve">1.2 Проверка работы </w:t>
       </w:r>
       <w:proofErr w:type="spellStart"/>
@@ -850,6 +957,7 @@
           <w:noProof/>
           <w:lang w:val="en-US"/>
         </w:rPr>
+        <w:lastRenderedPageBreak/>
         <w:drawing>
           <wp:inline distT="0" distB="0" distL="0" distR="0" wp14:anchorId="5FB2E31A" wp14:editId="535D26D3">
             <wp:extent cx="5940425" cy="3872230"/>
@@ -913,7 +1021,6 @@
         <w:jc w:val="both"/>
       </w:pPr>
       <w:r>
-        <w:lastRenderedPageBreak/>
         <w:t xml:space="preserve">2.3 </w:t>
       </w:r>
       <w:r>
@@ -1286,6 +1393,7 @@
           <w:iCs/>
           <w:lang w:val="en-US"/>
         </w:rPr>
+        <w:lastRenderedPageBreak/>
         <w:t>kubectl</w:t>
       </w:r>
       <w:proofErr w:type="spellEnd"/>
@@ -1407,50 +1515,422 @@
           <w:b/>
           <w:bCs/>
         </w:rPr>
+        <w:t>Этап 3: Развертывание демонстрационного приложения</w:t>
+      </w:r>
+    </w:p>
+    <w:p>
+      <w:pPr>
+        <w:jc w:val="both"/>
+      </w:pPr>
+    </w:p>
+    <w:p>
+      <w:pPr>
+        <w:ind w:firstLine="567"/>
+        <w:jc w:val="both"/>
+      </w:pPr>
+      <w:r>
+        <w:t xml:space="preserve">3.1 Создание объекта </w:t>
+      </w:r>
+      <w:r>
+        <w:rPr>
+          <w:lang w:val="en-US"/>
+        </w:rPr>
+        <w:t>Application</w:t>
+      </w:r>
+      <w:r>
+        <w:t xml:space="preserve">, </w:t>
+      </w:r>
+      <w:r>
+        <w:t xml:space="preserve">который свяжет </w:t>
+      </w:r>
+      <w:r>
+        <w:rPr>
+          <w:i/>
+          <w:iCs/>
+          <w:lang w:val="en-US"/>
+        </w:rPr>
+        <w:t>Git</w:t>
+      </w:r>
+      <w:r>
+        <w:t>-</w:t>
+      </w:r>
+      <w:r>
+        <w:t>репозиторий с кластером</w:t>
+      </w:r>
+      <w:r>
+        <w:t>:</w:t>
+      </w:r>
+    </w:p>
+    <w:p>
+      <w:pPr>
+        <w:jc w:val="both"/>
+        <w:rPr>
+          <w:i/>
+          <w:iCs/>
+          <w:lang w:val="en-US"/>
+        </w:rPr>
+      </w:pPr>
+      <w:proofErr w:type="spellStart"/>
+      <w:r>
+        <w:rPr>
+          <w:i/>
+          <w:iCs/>
+          <w:lang w:val="en-US"/>
+        </w:rPr>
+        <w:t>kubectl</w:t>
+      </w:r>
+      <w:proofErr w:type="spellEnd"/>
+      <w:r>
+        <w:rPr>
+          <w:i/>
+          <w:iCs/>
+          <w:lang w:val="en-US"/>
+        </w:rPr>
+        <w:t xml:space="preserve"> apply -f - &lt;&lt;EOF</w:t>
+      </w:r>
+    </w:p>
+    <w:p>
+      <w:pPr>
+        <w:jc w:val="both"/>
+        <w:rPr>
+          <w:i/>
+          <w:iCs/>
+          <w:lang w:val="en-US"/>
+        </w:rPr>
+      </w:pPr>
+      <w:proofErr w:type="spellStart"/>
+      <w:r>
+        <w:rPr>
+          <w:i/>
+          <w:iCs/>
+          <w:lang w:val="en-US"/>
+        </w:rPr>
+        <w:t>apiVersion</w:t>
+      </w:r>
+      <w:proofErr w:type="spellEnd"/>
+      <w:r>
+        <w:rPr>
+          <w:i/>
+          <w:iCs/>
+          <w:lang w:val="en-US"/>
+        </w:rPr>
+        <w:t>: argoproj.io/v1alpha1</w:t>
+      </w:r>
+    </w:p>
+    <w:p>
+      <w:pPr>
+        <w:jc w:val="both"/>
+        <w:rPr>
+          <w:i/>
+          <w:iCs/>
+          <w:lang w:val="en-US"/>
+        </w:rPr>
+      </w:pPr>
+      <w:r>
+        <w:rPr>
+          <w:i/>
+          <w:iCs/>
+          <w:lang w:val="en-US"/>
+        </w:rPr>
+        <w:t>kind: Application</w:t>
+      </w:r>
+    </w:p>
+    <w:p>
+      <w:pPr>
+        <w:jc w:val="both"/>
+        <w:rPr>
+          <w:i/>
+          <w:iCs/>
+          <w:lang w:val="en-US"/>
+        </w:rPr>
+      </w:pPr>
+      <w:r>
+        <w:rPr>
+          <w:i/>
+          <w:iCs/>
+          <w:lang w:val="en-US"/>
+        </w:rPr>
+        <w:t>metadata:</w:t>
+      </w:r>
+    </w:p>
+    <w:p>
+      <w:pPr>
+        <w:jc w:val="both"/>
+        <w:rPr>
+          <w:i/>
+          <w:iCs/>
+          <w:lang w:val="en-US"/>
+        </w:rPr>
+      </w:pPr>
+      <w:r>
+        <w:rPr>
+          <w:i/>
+          <w:iCs/>
+          <w:lang w:val="en-US"/>
+        </w:rPr>
+        <w:t xml:space="preserve">  name: guestbook</w:t>
+      </w:r>
+    </w:p>
+    <w:p>
+      <w:pPr>
+        <w:jc w:val="both"/>
+        <w:rPr>
+          <w:i/>
+          <w:iCs/>
+          <w:lang w:val="en-US"/>
+        </w:rPr>
+      </w:pPr>
+      <w:r>
+        <w:rPr>
+          <w:i/>
+          <w:iCs/>
+          <w:lang w:val="en-US"/>
+        </w:rPr>
+        <w:t xml:space="preserve">  namespace: </w:t>
+      </w:r>
+      <w:proofErr w:type="spellStart"/>
+      <w:r>
+        <w:rPr>
+          <w:i/>
+          <w:iCs/>
+          <w:lang w:val="en-US"/>
+        </w:rPr>
+        <w:t>argocd</w:t>
+      </w:r>
+      <w:proofErr w:type="spellEnd"/>
+    </w:p>
+    <w:p>
+      <w:pPr>
+        <w:jc w:val="both"/>
+        <w:rPr>
+          <w:i/>
+          <w:iCs/>
+          <w:lang w:val="en-US"/>
+        </w:rPr>
+      </w:pPr>
+      <w:r>
+        <w:rPr>
+          <w:i/>
+          <w:iCs/>
+          <w:lang w:val="en-US"/>
+        </w:rPr>
+        <w:t>spec:</w:t>
+      </w:r>
+    </w:p>
+    <w:p>
+      <w:pPr>
+        <w:jc w:val="both"/>
+        <w:rPr>
+          <w:i/>
+          <w:iCs/>
+          <w:lang w:val="en-US"/>
+        </w:rPr>
+      </w:pPr>
+      <w:r>
+        <w:rPr>
+          <w:i/>
+          <w:iCs/>
+          <w:lang w:val="en-US"/>
+        </w:rPr>
+        <w:t xml:space="preserve">  project: default</w:t>
+      </w:r>
+    </w:p>
+    <w:p>
+      <w:pPr>
+        <w:jc w:val="both"/>
+        <w:rPr>
+          <w:i/>
+          <w:iCs/>
+          <w:lang w:val="en-US"/>
+        </w:rPr>
+      </w:pPr>
+      <w:r>
+        <w:rPr>
+          <w:i/>
+          <w:iCs/>
+          <w:lang w:val="en-US"/>
+        </w:rPr>
+        <w:t xml:space="preserve">  source:</w:t>
+      </w:r>
+    </w:p>
+    <w:p>
+      <w:pPr>
+        <w:jc w:val="both"/>
+        <w:rPr>
+          <w:i/>
+          <w:iCs/>
+          <w:lang w:val="en-US"/>
+        </w:rPr>
+      </w:pPr>
+      <w:r>
+        <w:rPr>
+          <w:i/>
+          <w:iCs/>
+          <w:lang w:val="en-US"/>
+        </w:rPr>
+        <w:t xml:space="preserve">    </w:t>
+      </w:r>
+      <w:proofErr w:type="spellStart"/>
+      <w:r>
+        <w:rPr>
+          <w:i/>
+          <w:iCs/>
+          <w:lang w:val="en-US"/>
+        </w:rPr>
+        <w:t>repoURL</w:t>
+      </w:r>
+      <w:proofErr w:type="spellEnd"/>
+      <w:r>
+        <w:rPr>
+          <w:i/>
+          <w:iCs/>
+          <w:lang w:val="en-US"/>
+        </w:rPr>
+        <w:t>: https://github.com/argoproj/argocd-example-apps.git</w:t>
+      </w:r>
+    </w:p>
+    <w:p>
+      <w:pPr>
+        <w:jc w:val="both"/>
+        <w:rPr>
+          <w:i/>
+          <w:iCs/>
+          <w:lang w:val="en-US"/>
+        </w:rPr>
+      </w:pPr>
+      <w:r>
+        <w:rPr>
+          <w:i/>
+          <w:iCs/>
+          <w:lang w:val="en-US"/>
+        </w:rPr>
+        <w:t xml:space="preserve">    </w:t>
+      </w:r>
+      <w:proofErr w:type="spellStart"/>
+      <w:r>
+        <w:rPr>
+          <w:i/>
+          <w:iCs/>
+          <w:lang w:val="en-US"/>
+        </w:rPr>
+        <w:t>targetRevision</w:t>
+      </w:r>
+      <w:proofErr w:type="spellEnd"/>
+      <w:r>
+        <w:rPr>
+          <w:i/>
+          <w:iCs/>
+          <w:lang w:val="en-US"/>
+        </w:rPr>
+        <w:t>: HEAD</w:t>
+      </w:r>
+    </w:p>
+    <w:p>
+      <w:pPr>
+        <w:jc w:val="both"/>
+        <w:rPr>
+          <w:i/>
+          <w:iCs/>
+          <w:lang w:val="en-US"/>
+        </w:rPr>
+      </w:pPr>
+      <w:r>
+        <w:rPr>
+          <w:i/>
+          <w:iCs/>
+          <w:lang w:val="en-US"/>
+        </w:rPr>
         <w:lastRenderedPageBreak/>
-        <w:t>Этап 3: Развертывание демонстрационного приложения</w:t>
-      </w:r>
-    </w:p>
-    <w:p>
-      <w:pPr>
-        <w:jc w:val="both"/>
-      </w:pPr>
-    </w:p>
-    <w:p>
-      <w:pPr>
-        <w:ind w:firstLine="567"/>
-        <w:jc w:val="both"/>
-      </w:pPr>
-      <w:r>
-        <w:t xml:space="preserve">3.1 Создание объекта </w:t>
-      </w:r>
-      <w:r>
-        <w:rPr>
-          <w:lang w:val="en-US"/>
-        </w:rPr>
-        <w:t>Application</w:t>
-      </w:r>
-      <w:r>
-        <w:t xml:space="preserve">, </w:t>
-      </w:r>
-      <w:r>
-        <w:t xml:space="preserve">который свяжет </w:t>
-      </w:r>
-      <w:r>
-        <w:rPr>
-          <w:i/>
-          <w:iCs/>
-          <w:lang w:val="en-US"/>
-        </w:rPr>
-        <w:t>Git</w:t>
-      </w:r>
-      <w:r>
-        <w:t>-</w:t>
-      </w:r>
-      <w:r>
-        <w:t>репозиторий с кластером</w:t>
-      </w:r>
-      <w:r>
+        <w:t xml:space="preserve">    path: guestbook</w:t>
+      </w:r>
+    </w:p>
+    <w:p>
+      <w:pPr>
+        <w:jc w:val="both"/>
+        <w:rPr>
+          <w:i/>
+          <w:iCs/>
+          <w:lang w:val="en-US"/>
+        </w:rPr>
+      </w:pPr>
+      <w:r>
+        <w:rPr>
+          <w:i/>
+          <w:iCs/>
+          <w:lang w:val="en-US"/>
+        </w:rPr>
+        <w:t xml:space="preserve">  destination:</w:t>
+      </w:r>
+    </w:p>
+    <w:p>
+      <w:pPr>
+        <w:jc w:val="both"/>
+        <w:rPr>
+          <w:i/>
+          <w:iCs/>
+          <w:lang w:val="en-US"/>
+        </w:rPr>
+      </w:pPr>
+      <w:r>
+        <w:rPr>
+          <w:i/>
+          <w:iCs/>
+          <w:lang w:val="en-US"/>
+        </w:rPr>
+        <w:t xml:space="preserve">    server: https://kubernetes.default.svc</w:t>
+      </w:r>
+    </w:p>
+    <w:p>
+      <w:pPr>
+        <w:jc w:val="both"/>
+        <w:rPr>
+          <w:i/>
+          <w:iCs/>
+          <w:lang w:val="en-US"/>
+        </w:rPr>
+      </w:pPr>
+      <w:r>
+        <w:rPr>
+          <w:i/>
+          <w:iCs/>
+          <w:lang w:val="en-US"/>
+        </w:rPr>
+        <w:t xml:space="preserve">    namespace: default</w:t>
+      </w:r>
+    </w:p>
+    <w:p>
+      <w:pPr>
+        <w:jc w:val="both"/>
+        <w:rPr>
+          <w:i/>
+          <w:iCs/>
+          <w:lang w:val="en-US"/>
+        </w:rPr>
+      </w:pPr>
+      <w:r>
+        <w:rPr>
+          <w:i/>
+          <w:iCs/>
+          <w:lang w:val="en-US"/>
+        </w:rPr>
+        <w:t xml:space="preserve">  </w:t>
+      </w:r>
+      <w:proofErr w:type="spellStart"/>
+      <w:r>
+        <w:rPr>
+          <w:i/>
+          <w:iCs/>
+          <w:lang w:val="en-US"/>
+        </w:rPr>
+        <w:t>syncPolicy</w:t>
+      </w:r>
+      <w:proofErr w:type="spellEnd"/>
+      <w:r>
+        <w:rPr>
+          <w:i/>
+          <w:iCs/>
+          <w:lang w:val="en-US"/>
+        </w:rPr>
         <w:t>:</w:t>
       </w:r>
     </w:p>
@@ -1463,378 +1943,6 @@
           <w:lang w:val="en-US"/>
         </w:rPr>
       </w:pPr>
-      <w:proofErr w:type="spellStart"/>
-      <w:r>
-        <w:rPr>
-          <w:i/>
-          <w:iCs/>
-          <w:lang w:val="en-US"/>
-        </w:rPr>
-        <w:t>kubectl</w:t>
-      </w:r>
-      <w:proofErr w:type="spellEnd"/>
-      <w:r>
-        <w:rPr>
-          <w:i/>
-          <w:iCs/>
-          <w:lang w:val="en-US"/>
-        </w:rPr>
-        <w:t xml:space="preserve"> apply -f - &lt;&lt;EOF</w:t>
-      </w:r>
-    </w:p>
-    <w:p>
-      <w:pPr>
-        <w:jc w:val="both"/>
-        <w:rPr>
-          <w:i/>
-          <w:iCs/>
-          <w:lang w:val="en-US"/>
-        </w:rPr>
-      </w:pPr>
-      <w:proofErr w:type="spellStart"/>
-      <w:r>
-        <w:rPr>
-          <w:i/>
-          <w:iCs/>
-          <w:lang w:val="en-US"/>
-        </w:rPr>
-        <w:t>apiVersion</w:t>
-      </w:r>
-      <w:proofErr w:type="spellEnd"/>
-      <w:r>
-        <w:rPr>
-          <w:i/>
-          <w:iCs/>
-          <w:lang w:val="en-US"/>
-        </w:rPr>
-        <w:t>: argoproj.io/v1alpha1</w:t>
-      </w:r>
-    </w:p>
-    <w:p>
-      <w:pPr>
-        <w:jc w:val="both"/>
-        <w:rPr>
-          <w:i/>
-          <w:iCs/>
-          <w:lang w:val="en-US"/>
-        </w:rPr>
-      </w:pPr>
-      <w:r>
-        <w:rPr>
-          <w:i/>
-          <w:iCs/>
-          <w:lang w:val="en-US"/>
-        </w:rPr>
-        <w:t>kind: Application</w:t>
-      </w:r>
-    </w:p>
-    <w:p>
-      <w:pPr>
-        <w:jc w:val="both"/>
-        <w:rPr>
-          <w:i/>
-          <w:iCs/>
-          <w:lang w:val="en-US"/>
-        </w:rPr>
-      </w:pPr>
-      <w:r>
-        <w:rPr>
-          <w:i/>
-          <w:iCs/>
-          <w:lang w:val="en-US"/>
-        </w:rPr>
-        <w:t>metadata:</w:t>
-      </w:r>
-    </w:p>
-    <w:p>
-      <w:pPr>
-        <w:jc w:val="both"/>
-        <w:rPr>
-          <w:i/>
-          <w:iCs/>
-          <w:lang w:val="en-US"/>
-        </w:rPr>
-      </w:pPr>
-      <w:r>
-        <w:rPr>
-          <w:i/>
-          <w:iCs/>
-          <w:lang w:val="en-US"/>
-        </w:rPr>
-        <w:t xml:space="preserve">  name: guestbook</w:t>
-      </w:r>
-    </w:p>
-    <w:p>
-      <w:pPr>
-        <w:jc w:val="both"/>
-        <w:rPr>
-          <w:i/>
-          <w:iCs/>
-          <w:lang w:val="en-US"/>
-        </w:rPr>
-      </w:pPr>
-      <w:r>
-        <w:rPr>
-          <w:i/>
-          <w:iCs/>
-          <w:lang w:val="en-US"/>
-        </w:rPr>
-        <w:t xml:space="preserve">  namespace: </w:t>
-      </w:r>
-      <w:proofErr w:type="spellStart"/>
-      <w:r>
-        <w:rPr>
-          <w:i/>
-          <w:iCs/>
-          <w:lang w:val="en-US"/>
-        </w:rPr>
-        <w:t>argocd</w:t>
-      </w:r>
-      <w:proofErr w:type="spellEnd"/>
-    </w:p>
-    <w:p>
-      <w:pPr>
-        <w:jc w:val="both"/>
-        <w:rPr>
-          <w:i/>
-          <w:iCs/>
-          <w:lang w:val="en-US"/>
-        </w:rPr>
-      </w:pPr>
-      <w:r>
-        <w:rPr>
-          <w:i/>
-          <w:iCs/>
-          <w:lang w:val="en-US"/>
-        </w:rPr>
-        <w:t>spec:</w:t>
-      </w:r>
-    </w:p>
-    <w:p>
-      <w:pPr>
-        <w:jc w:val="both"/>
-        <w:rPr>
-          <w:i/>
-          <w:iCs/>
-          <w:lang w:val="en-US"/>
-        </w:rPr>
-      </w:pPr>
-      <w:r>
-        <w:rPr>
-          <w:i/>
-          <w:iCs/>
-          <w:lang w:val="en-US"/>
-        </w:rPr>
-        <w:t xml:space="preserve">  project: default</w:t>
-      </w:r>
-    </w:p>
-    <w:p>
-      <w:pPr>
-        <w:jc w:val="both"/>
-        <w:rPr>
-          <w:i/>
-          <w:iCs/>
-          <w:lang w:val="en-US"/>
-        </w:rPr>
-      </w:pPr>
-      <w:r>
-        <w:rPr>
-          <w:i/>
-          <w:iCs/>
-          <w:lang w:val="en-US"/>
-        </w:rPr>
-        <w:t xml:space="preserve">  source:</w:t>
-      </w:r>
-    </w:p>
-    <w:p>
-      <w:pPr>
-        <w:jc w:val="both"/>
-        <w:rPr>
-          <w:i/>
-          <w:iCs/>
-          <w:lang w:val="en-US"/>
-        </w:rPr>
-      </w:pPr>
-      <w:r>
-        <w:rPr>
-          <w:i/>
-          <w:iCs/>
-          <w:lang w:val="en-US"/>
-        </w:rPr>
-        <w:t xml:space="preserve">    </w:t>
-      </w:r>
-      <w:proofErr w:type="spellStart"/>
-      <w:r>
-        <w:rPr>
-          <w:i/>
-          <w:iCs/>
-          <w:lang w:val="en-US"/>
-        </w:rPr>
-        <w:t>repoURL</w:t>
-      </w:r>
-      <w:proofErr w:type="spellEnd"/>
-      <w:r>
-        <w:rPr>
-          <w:i/>
-          <w:iCs/>
-          <w:lang w:val="en-US"/>
-        </w:rPr>
-        <w:t>: https://github.com/argoproj/argocd-example-apps.git</w:t>
-      </w:r>
-    </w:p>
-    <w:p>
-      <w:pPr>
-        <w:jc w:val="both"/>
-        <w:rPr>
-          <w:i/>
-          <w:iCs/>
-          <w:lang w:val="en-US"/>
-        </w:rPr>
-      </w:pPr>
-      <w:r>
-        <w:rPr>
-          <w:i/>
-          <w:iCs/>
-          <w:lang w:val="en-US"/>
-        </w:rPr>
-        <w:t xml:space="preserve">    </w:t>
-      </w:r>
-      <w:proofErr w:type="spellStart"/>
-      <w:r>
-        <w:rPr>
-          <w:i/>
-          <w:iCs/>
-          <w:lang w:val="en-US"/>
-        </w:rPr>
-        <w:t>targetRevision</w:t>
-      </w:r>
-      <w:proofErr w:type="spellEnd"/>
-      <w:r>
-        <w:rPr>
-          <w:i/>
-          <w:iCs/>
-          <w:lang w:val="en-US"/>
-        </w:rPr>
-        <w:t>: HEAD</w:t>
-      </w:r>
-    </w:p>
-    <w:p>
-      <w:pPr>
-        <w:jc w:val="both"/>
-        <w:rPr>
-          <w:i/>
-          <w:iCs/>
-          <w:lang w:val="en-US"/>
-        </w:rPr>
-      </w:pPr>
-      <w:r>
-        <w:rPr>
-          <w:i/>
-          <w:iCs/>
-          <w:lang w:val="en-US"/>
-        </w:rPr>
-        <w:t xml:space="preserve">    path: guestbook</w:t>
-      </w:r>
-    </w:p>
-    <w:p>
-      <w:pPr>
-        <w:jc w:val="both"/>
-        <w:rPr>
-          <w:i/>
-          <w:iCs/>
-          <w:lang w:val="en-US"/>
-        </w:rPr>
-      </w:pPr>
-      <w:r>
-        <w:rPr>
-          <w:i/>
-          <w:iCs/>
-          <w:lang w:val="en-US"/>
-        </w:rPr>
-        <w:t xml:space="preserve">  destination:</w:t>
-      </w:r>
-    </w:p>
-    <w:p>
-      <w:pPr>
-        <w:jc w:val="both"/>
-        <w:rPr>
-          <w:i/>
-          <w:iCs/>
-          <w:lang w:val="en-US"/>
-        </w:rPr>
-      </w:pPr>
-      <w:r>
-        <w:rPr>
-          <w:i/>
-          <w:iCs/>
-          <w:lang w:val="en-US"/>
-        </w:rPr>
-        <w:t xml:space="preserve">    server: https://kubernetes.default.svc</w:t>
-      </w:r>
-    </w:p>
-    <w:p>
-      <w:pPr>
-        <w:jc w:val="both"/>
-        <w:rPr>
-          <w:i/>
-          <w:iCs/>
-          <w:lang w:val="en-US"/>
-        </w:rPr>
-      </w:pPr>
-      <w:r>
-        <w:rPr>
-          <w:i/>
-          <w:iCs/>
-          <w:lang w:val="en-US"/>
-        </w:rPr>
-        <w:t xml:space="preserve">    namespace: default</w:t>
-      </w:r>
-    </w:p>
-    <w:p>
-      <w:pPr>
-        <w:jc w:val="both"/>
-        <w:rPr>
-          <w:i/>
-          <w:iCs/>
-          <w:lang w:val="en-US"/>
-        </w:rPr>
-      </w:pPr>
-      <w:r>
-        <w:rPr>
-          <w:i/>
-          <w:iCs/>
-          <w:lang w:val="en-US"/>
-        </w:rPr>
-        <w:t xml:space="preserve">  </w:t>
-      </w:r>
-      <w:proofErr w:type="spellStart"/>
-      <w:r>
-        <w:rPr>
-          <w:i/>
-          <w:iCs/>
-          <w:lang w:val="en-US"/>
-        </w:rPr>
-        <w:t>syncPolicy</w:t>
-      </w:r>
-      <w:proofErr w:type="spellEnd"/>
-      <w:r>
-        <w:rPr>
-          <w:i/>
-          <w:iCs/>
-          <w:lang w:val="en-US"/>
-        </w:rPr>
-        <w:t>:</w:t>
-      </w:r>
-    </w:p>
-    <w:p>
-      <w:pPr>
-        <w:jc w:val="both"/>
-        <w:rPr>
-          <w:i/>
-          <w:iCs/>
-          <w:lang w:val="en-US"/>
-        </w:rPr>
-      </w:pPr>
       <w:r>
         <w:rPr>
           <w:i/>
@@ -1929,7 +2037,6 @@
           <w:noProof/>
           <w:lang w:val="en-US"/>
         </w:rPr>
-        <w:lastRenderedPageBreak/>
         <w:drawing>
           <wp:inline distT="0" distB="0" distL="0" distR="0" wp14:anchorId="1D8BC803" wp14:editId="786FB9DA">
             <wp:extent cx="5940425" cy="2665730"/>
@@ -2005,6 +2112,7 @@
           <w:noProof/>
           <w:lang w:val="en-US"/>
         </w:rPr>
+        <w:lastRenderedPageBreak/>
         <w:drawing>
           <wp:inline distT="0" distB="0" distL="0" distR="0" wp14:anchorId="551081B1" wp14:editId="738909F5">
             <wp:extent cx="5035187" cy="5051333"/>
@@ -2066,7 +2174,6 @@
           <w:noProof/>
           <w:lang w:val="en-US"/>
         </w:rPr>
-        <w:lastRenderedPageBreak/>
         <w:drawing>
           <wp:inline distT="0" distB="0" distL="0" distR="0" wp14:anchorId="3408CD9C" wp14:editId="0873C34D">
             <wp:extent cx="5940425" cy="1682115"/>
@@ -2117,6 +2224,7 @@
         <w:rPr>
           <w:noProof/>
         </w:rPr>
+        <w:lastRenderedPageBreak/>
         <w:drawing>
           <wp:inline distT="0" distB="0" distL="0" distR="0" wp14:anchorId="0453F72C" wp14:editId="7046DDB1">
             <wp:extent cx="5940425" cy="1731010"/>
@@ -2627,144 +2735,144 @@
           <w:iCs/>
           <w:lang w:val="en-US"/>
         </w:rPr>
+        <w:t>spec:</w:t>
+      </w:r>
+    </w:p>
+    <w:p>
+      <w:pPr>
+        <w:rPr>
+          <w:i/>
+          <w:iCs/>
+          <w:lang w:val="en-US"/>
+        </w:rPr>
+      </w:pPr>
+      <w:r>
+        <w:rPr>
+          <w:i/>
+          <w:iCs/>
+          <w:lang w:val="en-US"/>
+        </w:rPr>
+        <w:t xml:space="preserve">  rules:</w:t>
+      </w:r>
+    </w:p>
+    <w:p>
+      <w:pPr>
+        <w:rPr>
+          <w:i/>
+          <w:iCs/>
+          <w:lang w:val="en-US"/>
+        </w:rPr>
+      </w:pPr>
+      <w:r>
+        <w:rPr>
+          <w:i/>
+          <w:iCs/>
+          <w:lang w:val="en-US"/>
+        </w:rPr>
+        <w:t xml:space="preserve">  - host: argocd.cluster.k8s</w:t>
+      </w:r>
+    </w:p>
+    <w:p>
+      <w:pPr>
+        <w:rPr>
+          <w:i/>
+          <w:iCs/>
+          <w:lang w:val="en-US"/>
+        </w:rPr>
+      </w:pPr>
+      <w:r>
+        <w:rPr>
+          <w:i/>
+          <w:iCs/>
+          <w:lang w:val="en-US"/>
+        </w:rPr>
+        <w:t xml:space="preserve">    http:</w:t>
+      </w:r>
+    </w:p>
+    <w:p>
+      <w:pPr>
+        <w:rPr>
+          <w:i/>
+          <w:iCs/>
+          <w:lang w:val="en-US"/>
+        </w:rPr>
+      </w:pPr>
+      <w:r>
+        <w:rPr>
+          <w:i/>
+          <w:iCs/>
+          <w:lang w:val="en-US"/>
+        </w:rPr>
+        <w:t xml:space="preserve">      paths:</w:t>
+      </w:r>
+    </w:p>
+    <w:p>
+      <w:pPr>
+        <w:rPr>
+          <w:i/>
+          <w:iCs/>
+          <w:lang w:val="en-US"/>
+        </w:rPr>
+      </w:pPr>
+      <w:r>
+        <w:rPr>
+          <w:i/>
+          <w:iCs/>
+          <w:lang w:val="en-US"/>
+        </w:rPr>
+        <w:t xml:space="preserve">      - path: /</w:t>
+      </w:r>
+    </w:p>
+    <w:p>
+      <w:pPr>
+        <w:rPr>
+          <w:i/>
+          <w:iCs/>
+          <w:lang w:val="en-US"/>
+        </w:rPr>
+      </w:pPr>
+      <w:r>
+        <w:rPr>
+          <w:i/>
+          <w:iCs/>
+          <w:lang w:val="en-US"/>
+        </w:rPr>
+        <w:t xml:space="preserve">        </w:t>
+      </w:r>
+      <w:proofErr w:type="spellStart"/>
+      <w:r>
+        <w:rPr>
+          <w:i/>
+          <w:iCs/>
+          <w:lang w:val="en-US"/>
+        </w:rPr>
+        <w:t>pathType</w:t>
+      </w:r>
+      <w:proofErr w:type="spellEnd"/>
+      <w:r>
+        <w:rPr>
+          <w:i/>
+          <w:iCs/>
+          <w:lang w:val="en-US"/>
+        </w:rPr>
+        <w:t>: Prefix</w:t>
+      </w:r>
+    </w:p>
+    <w:p>
+      <w:pPr>
+        <w:rPr>
+          <w:i/>
+          <w:iCs/>
+          <w:lang w:val="en-US"/>
+        </w:rPr>
+      </w:pPr>
+      <w:r>
+        <w:rPr>
+          <w:i/>
+          <w:iCs/>
+          <w:lang w:val="en-US"/>
+        </w:rPr>
         <w:lastRenderedPageBreak/>
-        <w:t>spec:</w:t>
-      </w:r>
-    </w:p>
-    <w:p>
-      <w:pPr>
-        <w:rPr>
-          <w:i/>
-          <w:iCs/>
-          <w:lang w:val="en-US"/>
-        </w:rPr>
-      </w:pPr>
-      <w:r>
-        <w:rPr>
-          <w:i/>
-          <w:iCs/>
-          <w:lang w:val="en-US"/>
-        </w:rPr>
-        <w:t xml:space="preserve">  rules:</w:t>
-      </w:r>
-    </w:p>
-    <w:p>
-      <w:pPr>
-        <w:rPr>
-          <w:i/>
-          <w:iCs/>
-          <w:lang w:val="en-US"/>
-        </w:rPr>
-      </w:pPr>
-      <w:r>
-        <w:rPr>
-          <w:i/>
-          <w:iCs/>
-          <w:lang w:val="en-US"/>
-        </w:rPr>
-        <w:t xml:space="preserve">  - host: argocd.cluster.k8s</w:t>
-      </w:r>
-    </w:p>
-    <w:p>
-      <w:pPr>
-        <w:rPr>
-          <w:i/>
-          <w:iCs/>
-          <w:lang w:val="en-US"/>
-        </w:rPr>
-      </w:pPr>
-      <w:r>
-        <w:rPr>
-          <w:i/>
-          <w:iCs/>
-          <w:lang w:val="en-US"/>
-        </w:rPr>
-        <w:t xml:space="preserve">    http:</w:t>
-      </w:r>
-    </w:p>
-    <w:p>
-      <w:pPr>
-        <w:rPr>
-          <w:i/>
-          <w:iCs/>
-          <w:lang w:val="en-US"/>
-        </w:rPr>
-      </w:pPr>
-      <w:r>
-        <w:rPr>
-          <w:i/>
-          <w:iCs/>
-          <w:lang w:val="en-US"/>
-        </w:rPr>
-        <w:t xml:space="preserve">      paths:</w:t>
-      </w:r>
-    </w:p>
-    <w:p>
-      <w:pPr>
-        <w:rPr>
-          <w:i/>
-          <w:iCs/>
-          <w:lang w:val="en-US"/>
-        </w:rPr>
-      </w:pPr>
-      <w:r>
-        <w:rPr>
-          <w:i/>
-          <w:iCs/>
-          <w:lang w:val="en-US"/>
-        </w:rPr>
-        <w:t xml:space="preserve">      - path: /</w:t>
-      </w:r>
-    </w:p>
-    <w:p>
-      <w:pPr>
-        <w:rPr>
-          <w:i/>
-          <w:iCs/>
-          <w:lang w:val="en-US"/>
-        </w:rPr>
-      </w:pPr>
-      <w:r>
-        <w:rPr>
-          <w:i/>
-          <w:iCs/>
-          <w:lang w:val="en-US"/>
-        </w:rPr>
-        <w:t xml:space="preserve">        </w:t>
-      </w:r>
-      <w:proofErr w:type="spellStart"/>
-      <w:r>
-        <w:rPr>
-          <w:i/>
-          <w:iCs/>
-          <w:lang w:val="en-US"/>
-        </w:rPr>
-        <w:t>pathType</w:t>
-      </w:r>
-      <w:proofErr w:type="spellEnd"/>
-      <w:r>
-        <w:rPr>
-          <w:i/>
-          <w:iCs/>
-          <w:lang w:val="en-US"/>
-        </w:rPr>
-        <w:t>: Prefix</w:t>
-      </w:r>
-    </w:p>
-    <w:p>
-      <w:pPr>
-        <w:rPr>
-          <w:i/>
-          <w:iCs/>
-          <w:lang w:val="en-US"/>
-        </w:rPr>
-      </w:pPr>
-      <w:r>
-        <w:rPr>
-          <w:i/>
-          <w:iCs/>
-          <w:lang w:val="en-US"/>
-        </w:rPr>
         <w:t xml:space="preserve">        backend:</w:t>
       </w:r>
     </w:p>
@@ -3030,6 +3138,9 @@
         <w:jc w:val="center"/>
       </w:pPr>
       <w:r>
+        <w:rPr>
+          <w:noProof/>
+        </w:rPr>
         <w:drawing>
           <wp:inline distT="0" distB="0" distL="0" distR="0" wp14:anchorId="32847F9F" wp14:editId="2020B747">
             <wp:extent cx="5287113" cy="676369"/>
@@ -3127,7 +3238,9 @@
         <w:jc w:val="both"/>
       </w:pPr>
       <w:r>
-        <w:lastRenderedPageBreak/>
+        <w:rPr>
+          <w:noProof/>
+        </w:rPr>
         <w:drawing>
           <wp:inline distT="0" distB="0" distL="0" distR="0" wp14:anchorId="01B3C79E" wp14:editId="1F8BCDA2">
             <wp:extent cx="5940425" cy="2931160"/>
@@ -3187,6 +3300,7 @@
           <w:b/>
           <w:bCs/>
         </w:rPr>
+        <w:lastRenderedPageBreak/>
         <w:t xml:space="preserve">Доступность </w:t>
       </w:r>
       <w:proofErr w:type="spellStart"/>
@@ -3230,6 +3344,9 @@
         <w:jc w:val="both"/>
       </w:pPr>
       <w:r>
+        <w:rPr>
+          <w:noProof/>
+        </w:rPr>
         <w:drawing>
           <wp:inline distT="0" distB="0" distL="0" distR="0" wp14:anchorId="7B7BAA8D" wp14:editId="7120FD64">
             <wp:extent cx="5940425" cy="2959100"/>
@@ -3331,9 +3448,9 @@
       </w:pPr>
       <w:r>
         <w:rPr>
-          <w:lang w:val="en-US"/>
-        </w:rPr>
-        <w:lastRenderedPageBreak/>
+          <w:noProof/>
+          <w:lang w:val="en-US"/>
+        </w:rPr>
         <w:drawing>
           <wp:inline distT="0" distB="0" distL="0" distR="0" wp14:anchorId="177DCFF7" wp14:editId="50A0081A">
             <wp:extent cx="4172532" cy="3105583"/>
@@ -3415,6 +3532,10 @@
         <w:jc w:val="both"/>
       </w:pPr>
       <w:r>
+        <w:rPr>
+          <w:noProof/>
+        </w:rPr>
+        <w:lastRenderedPageBreak/>
         <w:drawing>
           <wp:inline distT="0" distB="0" distL="0" distR="0" wp14:anchorId="1F358087" wp14:editId="46A2F995">
             <wp:extent cx="5940425" cy="1399540"/>
@@ -3536,6 +3657,9 @@
         <w:jc w:val="both"/>
       </w:pPr>
       <w:r>
+        <w:rPr>
+          <w:noProof/>
+        </w:rPr>
         <w:drawing>
           <wp:inline distT="0" distB="0" distL="0" distR="0" wp14:anchorId="71B680BE" wp14:editId="0175DF01">
             <wp:extent cx="5868219" cy="590632"/>
@@ -3890,16 +4014,16 @@
     </w:lvl>
   </w:abstractNum>
   <w:abstractNum w:abstractNumId="2" w15:restartNumberingAfterBreak="0">
-    <w:nsid w:val="463344D0"/>
+    <w:nsid w:val="45D245DD"/>
     <w:multiLevelType w:val="hybridMultilevel"/>
-    <w:tmpl w:val="9C501D1A"/>
-    <w:lvl w:ilvl="0" w:tplc="0419000F">
+    <w:tmpl w:val="D892F0A4"/>
+    <w:lvl w:ilvl="0" w:tplc="1F44F858">
       <w:start w:val="1"/>
       <w:numFmt w:val="decimal"/>
       <w:lvlText w:val="%1."/>
       <w:lvlJc w:val="left"/>
       <w:pPr>
-        <w:ind w:left="720" w:hanging="360"/>
+        <w:ind w:left="927" w:hanging="360"/>
       </w:pPr>
       <w:rPr>
         <w:rFonts w:hint="default"/>
@@ -3911,7 +4035,7 @@
       <w:lvlText w:val="%2."/>
       <w:lvlJc w:val="left"/>
       <w:pPr>
-        <w:ind w:left="1440" w:hanging="360"/>
+        <w:ind w:left="1647" w:hanging="360"/>
       </w:pPr>
     </w:lvl>
     <w:lvl w:ilvl="2" w:tplc="0419001B" w:tentative="1">
@@ -3920,7 +4044,7 @@
       <w:lvlText w:val="%3."/>
       <w:lvlJc w:val="right"/>
       <w:pPr>
-        <w:ind w:left="2160" w:hanging="180"/>
+        <w:ind w:left="2367" w:hanging="180"/>
       </w:pPr>
     </w:lvl>
     <w:lvl w:ilvl="3" w:tplc="0419000F" w:tentative="1">
@@ -3929,7 +4053,7 @@
       <w:lvlText w:val="%4."/>
       <w:lvlJc w:val="left"/>
       <w:pPr>
-        <w:ind w:left="2880" w:hanging="360"/>
+        <w:ind w:left="3087" w:hanging="360"/>
       </w:pPr>
     </w:lvl>
     <w:lvl w:ilvl="4" w:tplc="04190019" w:tentative="1">
@@ -3938,7 +4062,7 @@
       <w:lvlText w:val="%5."/>
       <w:lvlJc w:val="left"/>
       <w:pPr>
-        <w:ind w:left="3600" w:hanging="360"/>
+        <w:ind w:left="3807" w:hanging="360"/>
       </w:pPr>
     </w:lvl>
     <w:lvl w:ilvl="5" w:tplc="0419001B" w:tentative="1">
@@ -3947,7 +4071,7 @@
       <w:lvlText w:val="%6."/>
       <w:lvlJc w:val="right"/>
       <w:pPr>
-        <w:ind w:left="4320" w:hanging="180"/>
+        <w:ind w:left="4527" w:hanging="180"/>
       </w:pPr>
     </w:lvl>
     <w:lvl w:ilvl="6" w:tplc="0419000F" w:tentative="1">
@@ -3956,7 +4080,7 @@
       <w:lvlText w:val="%7."/>
       <w:lvlJc w:val="left"/>
       <w:pPr>
-        <w:ind w:left="5040" w:hanging="360"/>
+        <w:ind w:left="5247" w:hanging="360"/>
       </w:pPr>
     </w:lvl>
     <w:lvl w:ilvl="7" w:tplc="04190019" w:tentative="1">
@@ -3965,7 +4089,7 @@
       <w:lvlText w:val="%8."/>
       <w:lvlJc w:val="left"/>
       <w:pPr>
-        <w:ind w:left="5760" w:hanging="360"/>
+        <w:ind w:left="5967" w:hanging="360"/>
       </w:pPr>
     </w:lvl>
     <w:lvl w:ilvl="8" w:tplc="0419001B" w:tentative="1">
@@ -3974,6 +4098,95 @@
       <w:lvlText w:val="%9."/>
       <w:lvlJc w:val="right"/>
       <w:pPr>
+        <w:ind w:left="6687" w:hanging="180"/>
+      </w:pPr>
+    </w:lvl>
+  </w:abstractNum>
+  <w:abstractNum w:abstractNumId="3" w15:restartNumberingAfterBreak="0">
+    <w:nsid w:val="463344D0"/>
+    <w:multiLevelType w:val="hybridMultilevel"/>
+    <w:tmpl w:val="9C501D1A"/>
+    <w:lvl w:ilvl="0" w:tplc="0419000F">
+      <w:start w:val="1"/>
+      <w:numFmt w:val="decimal"/>
+      <w:lvlText w:val="%1."/>
+      <w:lvlJc w:val="left"/>
+      <w:pPr>
+        <w:ind w:left="720" w:hanging="360"/>
+      </w:pPr>
+      <w:rPr>
+        <w:rFonts w:hint="default"/>
+      </w:rPr>
+    </w:lvl>
+    <w:lvl w:ilvl="1" w:tplc="04190019" w:tentative="1">
+      <w:start w:val="1"/>
+      <w:numFmt w:val="lowerLetter"/>
+      <w:lvlText w:val="%2."/>
+      <w:lvlJc w:val="left"/>
+      <w:pPr>
+        <w:ind w:left="1440" w:hanging="360"/>
+      </w:pPr>
+    </w:lvl>
+    <w:lvl w:ilvl="2" w:tplc="0419001B" w:tentative="1">
+      <w:start w:val="1"/>
+      <w:numFmt w:val="lowerRoman"/>
+      <w:lvlText w:val="%3."/>
+      <w:lvlJc w:val="right"/>
+      <w:pPr>
+        <w:ind w:left="2160" w:hanging="180"/>
+      </w:pPr>
+    </w:lvl>
+    <w:lvl w:ilvl="3" w:tplc="0419000F" w:tentative="1">
+      <w:start w:val="1"/>
+      <w:numFmt w:val="decimal"/>
+      <w:lvlText w:val="%4."/>
+      <w:lvlJc w:val="left"/>
+      <w:pPr>
+        <w:ind w:left="2880" w:hanging="360"/>
+      </w:pPr>
+    </w:lvl>
+    <w:lvl w:ilvl="4" w:tplc="04190019" w:tentative="1">
+      <w:start w:val="1"/>
+      <w:numFmt w:val="lowerLetter"/>
+      <w:lvlText w:val="%5."/>
+      <w:lvlJc w:val="left"/>
+      <w:pPr>
+        <w:ind w:left="3600" w:hanging="360"/>
+      </w:pPr>
+    </w:lvl>
+    <w:lvl w:ilvl="5" w:tplc="0419001B" w:tentative="1">
+      <w:start w:val="1"/>
+      <w:numFmt w:val="lowerRoman"/>
+      <w:lvlText w:val="%6."/>
+      <w:lvlJc w:val="right"/>
+      <w:pPr>
+        <w:ind w:left="4320" w:hanging="180"/>
+      </w:pPr>
+    </w:lvl>
+    <w:lvl w:ilvl="6" w:tplc="0419000F" w:tentative="1">
+      <w:start w:val="1"/>
+      <w:numFmt w:val="decimal"/>
+      <w:lvlText w:val="%7."/>
+      <w:lvlJc w:val="left"/>
+      <w:pPr>
+        <w:ind w:left="5040" w:hanging="360"/>
+      </w:pPr>
+    </w:lvl>
+    <w:lvl w:ilvl="7" w:tplc="04190019" w:tentative="1">
+      <w:start w:val="1"/>
+      <w:numFmt w:val="lowerLetter"/>
+      <w:lvlText w:val="%8."/>
+      <w:lvlJc w:val="left"/>
+      <w:pPr>
+        <w:ind w:left="5760" w:hanging="360"/>
+      </w:pPr>
+    </w:lvl>
+    <w:lvl w:ilvl="8" w:tplc="0419001B" w:tentative="1">
+      <w:start w:val="1"/>
+      <w:numFmt w:val="lowerRoman"/>
+      <w:lvlText w:val="%9."/>
+      <w:lvlJc w:val="right"/>
+      <w:pPr>
         <w:ind w:left="6480" w:hanging="180"/>
       </w:pPr>
     </w:lvl>
@@ -3982,10 +4195,13 @@
     <w:abstractNumId w:val="1"/>
   </w:num>
   <w:num w:numId="2" w16cid:durableId="1176385060">
-    <w:abstractNumId w:val="2"/>
+    <w:abstractNumId w:val="3"/>
   </w:num>
   <w:num w:numId="3" w16cid:durableId="1889216529">
     <w:abstractNumId w:val="0"/>
+  </w:num>
+  <w:num w:numId="4" w16cid:durableId="464855912">
+    <w:abstractNumId w:val="2"/>
   </w:num>
 </w:numbering>
 </file>
@@ -4589,6 +4805,7 @@
   <w:style w:type="character" w:default="1" w:styleId="a0">
     <w:name w:val="Default Paragraph Font"/>
     <w:uiPriority w:val="1"/>
+    <w:semiHidden/>
     <w:unhideWhenUsed/>
   </w:style>
   <w:style w:type="table" w:default="1" w:styleId="a1">

</xml_diff>